<commit_message>
Designed the backend objects and DAL that will be used in the Timecard page
</commit_message>
<xml_diff>
--- a/Documentation/AI Prompts/Vibe Coding - Regularization Request.docx
+++ b/Documentation/AI Prompts/Vibe Coding - Regularization Request.docx
@@ -1229,6 +1229,386 @@
       </w:pPr>
       <w:r>
         <w:t>}</w:t>
+      </w:r>
+    </w:p>
+    <w:p>
+      <w:pPr>
+        <w:spacing w:after="0" w:line="240" w:lineRule="auto"/>
+      </w:pPr>
+    </w:p>
+    <w:p>
+      <w:pPr>
+        <w:spacing w:after="0" w:line="240" w:lineRule="auto"/>
+        <w:rPr>
+          <w:b/>
+          <w:bCs/>
+          <w:color w:val="EE0000"/>
+          <w:u w:val="single"/>
+        </w:rPr>
+      </w:pPr>
+      <w:r>
+        <w:rPr>
+          <w:b/>
+          <w:bCs/>
+          <w:color w:val="EE0000"/>
+          <w:u w:val="single"/>
+        </w:rPr>
+        <w:t>Prompt #2:</w:t>
+      </w:r>
+    </w:p>
+    <w:p>
+      <w:pPr>
+        <w:spacing w:after="0" w:line="240" w:lineRule="auto"/>
+      </w:pPr>
+    </w:p>
+    <w:p>
+      <w:pPr>
+        <w:spacing w:after="0" w:line="240" w:lineRule="auto"/>
+      </w:pPr>
+      <w:r>
+        <w:t xml:space="preserve">Tell me how to disable the </w:t>
+      </w:r>
+      <w:proofErr w:type="spellStart"/>
+      <w:r>
+        <w:t>MudDatePicker</w:t>
+      </w:r>
+      <w:proofErr w:type="spellEnd"/>
+      <w:r>
+        <w:t xml:space="preserve"> control dynamically using code-behind. Below is the Blazor markup code for rendering the date picker control:</w:t>
+      </w:r>
+    </w:p>
+    <w:p>
+      <w:pPr>
+        <w:spacing w:after="0" w:line="240" w:lineRule="auto"/>
+      </w:pPr>
+    </w:p>
+    <w:p>
+      <w:pPr>
+        <w:spacing w:after="0" w:line="240" w:lineRule="auto"/>
+      </w:pPr>
+      <w:r>
+        <w:t>&lt;</w:t>
+      </w:r>
+      <w:proofErr w:type="spellStart"/>
+      <w:r>
+        <w:t>MudPaper</w:t>
+      </w:r>
+      <w:proofErr w:type="spellEnd"/>
+      <w:r>
+        <w:t xml:space="preserve"> Elevation="0" Class="pa-0 w-100"&gt;</w:t>
+      </w:r>
+    </w:p>
+    <w:p>
+      <w:pPr>
+        <w:spacing w:after="0" w:line="240" w:lineRule="auto"/>
+      </w:pPr>
+      <w:r>
+        <w:t xml:space="preserve">    &lt;</w:t>
+      </w:r>
+      <w:proofErr w:type="spellStart"/>
+      <w:r>
+        <w:t>MudBreakpointProvider</w:t>
+      </w:r>
+      <w:proofErr w:type="spellEnd"/>
+      <w:r>
+        <w:t xml:space="preserve"> </w:t>
+      </w:r>
+      <w:proofErr w:type="spellStart"/>
+      <w:r>
+        <w:t>OnBreakpointChanged</w:t>
+      </w:r>
+      <w:proofErr w:type="spellEnd"/>
+      <w:r>
+        <w:t>="</w:t>
+      </w:r>
+      <w:proofErr w:type="spellStart"/>
+      <w:r>
+        <w:t>OnBreakpointChanged</w:t>
+      </w:r>
+      <w:proofErr w:type="spellEnd"/>
+      <w:r>
+        <w:t>"&gt;</w:t>
+      </w:r>
+    </w:p>
+    <w:p>
+      <w:pPr>
+        <w:spacing w:after="0" w:line="240" w:lineRule="auto"/>
+      </w:pPr>
+      <w:r>
+        <w:t xml:space="preserve">        &lt;div @key="_calendarRenderKey"&gt;</w:t>
+      </w:r>
+    </w:p>
+    <w:p>
+      <w:pPr>
+        <w:spacing w:after="0" w:line="240" w:lineRule="auto"/>
+      </w:pPr>
+      <w:r>
+        <w:t xml:space="preserve">            &lt;</w:t>
+      </w:r>
+      <w:proofErr w:type="spellStart"/>
+      <w:r>
+        <w:t>MudDatePicker</w:t>
+      </w:r>
+      <w:proofErr w:type="spellEnd"/>
+      <w:r>
+        <w:t xml:space="preserve"> </w:t>
+      </w:r>
+      <w:proofErr w:type="spellStart"/>
+      <w:r>
+        <w:t>PickerVariant</w:t>
+      </w:r>
+      <w:proofErr w:type="spellEnd"/>
+      <w:r>
+        <w:t>="</w:t>
+      </w:r>
+      <w:proofErr w:type="spellStart"/>
+      <w:r>
+        <w:t>PickerVariant.Static</w:t>
+      </w:r>
+      <w:proofErr w:type="spellEnd"/>
+      <w:r>
+        <w:t>"</w:t>
+      </w:r>
+    </w:p>
+    <w:p>
+      <w:pPr>
+        <w:spacing w:after="0" w:line="240" w:lineRule="auto"/>
+      </w:pPr>
+      <w:r>
+        <w:t xml:space="preserve">                           @ref="_picker"</w:t>
+      </w:r>
+    </w:p>
+    <w:p>
+      <w:pPr>
+        <w:spacing w:after="0" w:line="240" w:lineRule="auto"/>
+      </w:pPr>
+      <w:r>
+        <w:t xml:space="preserve">                           Color="</w:t>
+      </w:r>
+      <w:proofErr w:type="spellStart"/>
+      <w:r>
+        <w:t>Color.Dark</w:t>
+      </w:r>
+      <w:proofErr w:type="spellEnd"/>
+      <w:r>
+        <w:t>"</w:t>
+      </w:r>
+    </w:p>
+    <w:p>
+      <w:pPr>
+        <w:spacing w:after="0" w:line="240" w:lineRule="auto"/>
+      </w:pPr>
+      <w:r>
+        <w:t xml:space="preserve">                           Rounded="true"</w:t>
+      </w:r>
+    </w:p>
+    <w:p>
+      <w:pPr>
+        <w:spacing w:after="0" w:line="240" w:lineRule="auto"/>
+      </w:pPr>
+      <w:r>
+        <w:t xml:space="preserve">                           Elevation="0"</w:t>
+      </w:r>
+    </w:p>
+    <w:p>
+      <w:pPr>
+        <w:spacing w:after="0" w:line="240" w:lineRule="auto"/>
+      </w:pPr>
+      <w:r>
+        <w:t xml:space="preserve">                           Orientation="@_</w:t>
+      </w:r>
+      <w:proofErr w:type="spellStart"/>
+      <w:r>
+        <w:t>calOrientation</w:t>
+      </w:r>
+      <w:proofErr w:type="spellEnd"/>
+      <w:r>
+        <w:t>"</w:t>
+      </w:r>
+    </w:p>
+    <w:p>
+      <w:pPr>
+        <w:spacing w:after="0" w:line="240" w:lineRule="auto"/>
+      </w:pPr>
+      <w:r>
+        <w:t xml:space="preserve">                           Date="@_</w:t>
+      </w:r>
+      <w:proofErr w:type="spellStart"/>
+      <w:r>
+        <w:t>selectedDate</w:t>
+      </w:r>
+      <w:proofErr w:type="spellEnd"/>
+      <w:r>
+        <w:t>"</w:t>
+      </w:r>
+    </w:p>
+    <w:p>
+      <w:pPr>
+        <w:spacing w:after="0" w:line="240" w:lineRule="auto"/>
+      </w:pPr>
+      <w:r>
+        <w:t xml:space="preserve">                           </w:t>
+      </w:r>
+      <w:proofErr w:type="spellStart"/>
+      <w:r>
+        <w:t>DateChanged</w:t>
+      </w:r>
+      <w:proofErr w:type="spellEnd"/>
+      <w:r>
+        <w:t>="</w:t>
+      </w:r>
+      <w:proofErr w:type="spellStart"/>
+      <w:r>
+        <w:t>OnDateChanged</w:t>
+      </w:r>
+      <w:proofErr w:type="spellEnd"/>
+      <w:r>
+        <w:t>"</w:t>
+      </w:r>
+    </w:p>
+    <w:p>
+      <w:pPr>
+        <w:spacing w:after="0" w:line="240" w:lineRule="auto"/>
+      </w:pPr>
+      <w:r>
+        <w:t xml:space="preserve">                           Style="@_</w:t>
+      </w:r>
+      <w:proofErr w:type="spellStart"/>
+      <w:r>
+        <w:t>pickerStyle</w:t>
+      </w:r>
+      <w:proofErr w:type="spellEnd"/>
+      <w:r>
+        <w:t>"</w:t>
+      </w:r>
+    </w:p>
+    <w:p>
+      <w:pPr>
+        <w:spacing w:after="0" w:line="240" w:lineRule="auto"/>
+      </w:pPr>
+      <w:r>
+        <w:lastRenderedPageBreak/>
+        <w:t xml:space="preserve">                           </w:t>
+      </w:r>
+      <w:proofErr w:type="spellStart"/>
+      <w:r>
+        <w:t>PickerDayContent</w:t>
+      </w:r>
+      <w:proofErr w:type="spellEnd"/>
+      <w:r>
+        <w:t>="</w:t>
+      </w:r>
+      <w:proofErr w:type="spellStart"/>
+      <w:r>
+        <w:t>CalendarDayTemplate</w:t>
+      </w:r>
+      <w:proofErr w:type="spellEnd"/>
+      <w:r>
+        <w:t xml:space="preserve">"                                                       </w:t>
+      </w:r>
+    </w:p>
+    <w:p>
+      <w:pPr>
+        <w:spacing w:after="0" w:line="240" w:lineRule="auto"/>
+      </w:pPr>
+      <w:r>
+        <w:t xml:space="preserve">                           </w:t>
+      </w:r>
+      <w:proofErr w:type="spellStart"/>
+      <w:r>
+        <w:t>MaxDate</w:t>
+      </w:r>
+      <w:proofErr w:type="spellEnd"/>
+      <w:r>
+        <w:t>="@</w:t>
+      </w:r>
+      <w:proofErr w:type="spellStart"/>
+      <w:r>
+        <w:t>DateTime.Today</w:t>
+      </w:r>
+      <w:proofErr w:type="spellEnd"/>
+      <w:r>
+        <w:t>"</w:t>
+      </w:r>
+    </w:p>
+    <w:p>
+      <w:pPr>
+        <w:spacing w:after="0" w:line="240" w:lineRule="auto"/>
+      </w:pPr>
+      <w:r>
+        <w:t xml:space="preserve">                           </w:t>
+      </w:r>
+      <w:proofErr w:type="spellStart"/>
+      <w:r>
+        <w:t>ReadOnly</w:t>
+      </w:r>
+      <w:proofErr w:type="spellEnd"/>
+      <w:r>
+        <w:t>="@_</w:t>
+      </w:r>
+      <w:proofErr w:type="spellStart"/>
+      <w:r>
+        <w:t>isDisabled</w:t>
+      </w:r>
+      <w:proofErr w:type="spellEnd"/>
+      <w:r>
+        <w:t>"&gt;</w:t>
+      </w:r>
+    </w:p>
+    <w:p>
+      <w:pPr>
+        <w:spacing w:after="0" w:line="240" w:lineRule="auto"/>
+      </w:pPr>
+      <w:r>
+        <w:t xml:space="preserve">            &lt;/</w:t>
+      </w:r>
+      <w:proofErr w:type="spellStart"/>
+      <w:r>
+        <w:t>MudDatePicker</w:t>
+      </w:r>
+      <w:proofErr w:type="spellEnd"/>
+      <w:r>
+        <w:t>&gt;</w:t>
+      </w:r>
+    </w:p>
+    <w:p>
+      <w:pPr>
+        <w:spacing w:after="0" w:line="240" w:lineRule="auto"/>
+      </w:pPr>
+      <w:r>
+        <w:t xml:space="preserve">        &lt;/div&gt;</w:t>
+      </w:r>
+    </w:p>
+    <w:p>
+      <w:pPr>
+        <w:spacing w:after="0" w:line="240" w:lineRule="auto"/>
+      </w:pPr>
+      <w:r>
+        <w:t xml:space="preserve">    &lt;/</w:t>
+      </w:r>
+      <w:proofErr w:type="spellStart"/>
+      <w:r>
+        <w:t>MudBreakpointProvider</w:t>
+      </w:r>
+      <w:proofErr w:type="spellEnd"/>
+      <w:r>
+        <w:t>&gt;</w:t>
+      </w:r>
+    </w:p>
+    <w:p>
+      <w:pPr>
+        <w:spacing w:after="0" w:line="240" w:lineRule="auto"/>
+      </w:pPr>
+      <w:r>
+        <w:t>&lt;/</w:t>
+      </w:r>
+      <w:proofErr w:type="spellStart"/>
+      <w:r>
+        <w:t>MudPaper</w:t>
+      </w:r>
+      <w:proofErr w:type="spellEnd"/>
+      <w:r>
+        <w:t>&gt;</w:t>
       </w:r>
     </w:p>
     <w:sectPr>

</xml_diff>